<commit_message>
feat(microservices: Emiren): Refactoring, adding extra variables for contest generator
</commit_message>
<xml_diff>
--- a/protocol/src/main/resources/contest_template.docx
+++ b/protocol/src/main/resources/contest_template.docx
@@ -243,7 +243,27 @@
                 <w:sz w:val="24"/>
                 <w:lang w:val="en-US"/>
               </w:rPr>
-              <w:t>{{projectName}}</w:t>
+              <w:t>{{</w:t>
+            </w:r>
+            <w:proofErr w:type="spellStart"/>
+            <w:r>
+              <w:rPr>
+                <w:b/>
+                <w:bCs/>
+                <w:sz w:val="24"/>
+                <w:lang w:val="en-US"/>
+              </w:rPr>
+              <w:t>projectName</w:t>
+            </w:r>
+            <w:proofErr w:type="spellEnd"/>
+            <w:r>
+              <w:rPr>
+                <w:b/>
+                <w:bCs/>
+                <w:sz w:val="24"/>
+                <w:lang w:val="en-US"/>
+              </w:rPr>
+              <w:t>}}</w:t>
             </w:r>
           </w:p>
         </w:tc>
@@ -464,12 +484,14 @@
               </w:rPr>
               <w:t>*</w:t>
             </w:r>
+            <w:proofErr w:type="spellStart"/>
             <w:r>
               <w:rPr>
                 <w:sz w:val="24"/>
               </w:rPr>
               <w:t>scientificArea</w:t>
             </w:r>
+            <w:proofErr w:type="spellEnd"/>
             <w:r>
               <w:rPr>
                 <w:sz w:val="24"/>
@@ -820,6 +842,7 @@
               </w:rPr>
               <w:t>*</w:t>
             </w:r>
+            <w:proofErr w:type="spellStart"/>
             <w:r>
               <w:rPr>
                 <w:i/>
@@ -838,6 +861,7 @@
               </w:rPr>
               <w:t>oals</w:t>
             </w:r>
+            <w:proofErr w:type="spellEnd"/>
             <w:r>
               <w:rPr>
                 <w:i/>
@@ -891,6 +915,7 @@
               </w:rPr>
               <w:t>*</w:t>
             </w:r>
+            <w:proofErr w:type="spellStart"/>
             <w:r>
               <w:rPr>
                 <w:i/>
@@ -899,6 +924,7 @@
               </w:rPr>
               <w:t>annotationRelevance</w:t>
             </w:r>
+            <w:proofErr w:type="spellEnd"/>
             <w:r>
               <w:rPr>
                 <w:i/>
@@ -952,6 +978,7 @@
               </w:rPr>
               <w:t>*</w:t>
             </w:r>
+            <w:proofErr w:type="spellStart"/>
             <w:r>
               <w:rPr>
                 <w:i/>
@@ -960,6 +987,7 @@
               </w:rPr>
               <w:t>annotationNovelty</w:t>
             </w:r>
+            <w:proofErr w:type="spellEnd"/>
             <w:r>
               <w:rPr>
                 <w:i/>
@@ -1015,6 +1043,7 @@
               </w:rPr>
               <w:t>*</w:t>
             </w:r>
+            <w:proofErr w:type="spellStart"/>
             <w:r>
               <w:rPr>
                 <w:i/>
@@ -1023,6 +1052,7 @@
               </w:rPr>
               <w:t>plannedScientificResults</w:t>
             </w:r>
+            <w:proofErr w:type="spellEnd"/>
             <w:r>
               <w:rPr>
                 <w:i/>
@@ -1209,6 +1239,7 @@
               </w:rPr>
               <w:t>{{</w:t>
             </w:r>
+            <w:proofErr w:type="spellStart"/>
             <w:r>
               <w:rPr>
                 <w:b/>
@@ -1217,6 +1248,7 @@
               </w:rPr>
               <w:t>mainEducationalOrScientificUnit</w:t>
             </w:r>
+            <w:proofErr w:type="spellEnd"/>
             <w:r>
               <w:rPr>
                 <w:b/>
@@ -1431,7 +1463,22 @@
                 <w:sz w:val="24"/>
                 <w:lang w:val="en-US"/>
               </w:rPr>
-              <w:t>{{projectSupervisor}}</w:t>
+              <w:t>{{</w:t>
+            </w:r>
+            <w:proofErr w:type="spellStart"/>
+            <w:r>
+              <w:rPr>
+                <w:sz w:val="24"/>
+              </w:rPr>
+              <w:t>projectSupervisor</w:t>
+            </w:r>
+            <w:proofErr w:type="spellEnd"/>
+            <w:r>
+              <w:rPr>
+                <w:sz w:val="24"/>
+                <w:lang w:val="en-US"/>
+              </w:rPr>
+              <w:t>}}</w:t>
             </w:r>
           </w:p>
           <w:p>
@@ -1695,7 +1742,27 @@
                 <w:sz w:val="24"/>
                 <w:lang w:val="en-US"/>
               </w:rPr>
-              <w:t>{{projectName}}</w:t>
+              <w:t>{{</w:t>
+            </w:r>
+            <w:proofErr w:type="spellStart"/>
+            <w:r>
+              <w:rPr>
+                <w:b/>
+                <w:bCs/>
+                <w:sz w:val="24"/>
+                <w:lang w:val="en-US"/>
+              </w:rPr>
+              <w:t>projectName</w:t>
+            </w:r>
+            <w:proofErr w:type="spellEnd"/>
+            <w:r>
+              <w:rPr>
+                <w:b/>
+                <w:bCs/>
+                <w:sz w:val="24"/>
+                <w:lang w:val="en-US"/>
+              </w:rPr>
+              <w:t>}}</w:t>
             </w:r>
           </w:p>
         </w:tc>
@@ -1900,12 +1967,14 @@
               </w:rPr>
               <w:t>{{*</w:t>
             </w:r>
+            <w:proofErr w:type="spellStart"/>
             <w:r>
               <w:rPr>
                 <w:sz w:val="24"/>
               </w:rPr>
               <w:t>scientificArea</w:t>
             </w:r>
+            <w:proofErr w:type="spellEnd"/>
             <w:r>
               <w:rPr>
                 <w:sz w:val="24"/>
@@ -2062,7 +2131,27 @@
               <w:rPr>
                 <w:sz w:val="24"/>
               </w:rPr>
-              <w:t xml:space="preserve"> фундаментальное</w:t>
+              <w:t xml:space="preserve"> </w:t>
+            </w:r>
+            <w:r>
+              <w:rPr>
+                <w:sz w:val="24"/>
+              </w:rPr>
+              <w:t>{{</w:t>
+            </w:r>
+            <w:proofErr w:type="spellStart"/>
+            <w:r>
+              <w:rPr>
+                <w:sz w:val="24"/>
+              </w:rPr>
+              <w:t>researchDirections</w:t>
+            </w:r>
+            <w:proofErr w:type="spellEnd"/>
+            <w:r>
+              <w:rPr>
+                <w:sz w:val="24"/>
+              </w:rPr>
+              <w:t>}}</w:t>
             </w:r>
           </w:p>
         </w:tc>
@@ -2450,6 +2539,7 @@
               </w:rPr>
               <w:t>*</w:t>
             </w:r>
+            <w:proofErr w:type="spellStart"/>
             <w:r>
               <w:rPr>
                 <w:i/>
@@ -2459,6 +2549,7 @@
               </w:rPr>
               <w:t>annotationGoals</w:t>
             </w:r>
+            <w:proofErr w:type="spellEnd"/>
             <w:r>
               <w:rPr>
                 <w:i/>
@@ -2545,7 +2636,6 @@
             <w:pPr>
               <w:pStyle w:val="whitespace-normal"/>
               <w:spacing w:before="0" w:beforeAutospacing="0" w:after="0" w:afterAutospacing="0"/>
-              <w:ind w:left="1440"/>
             </w:pPr>
             <w:r>
               <w:rPr>
@@ -2553,7 +2643,33 @@
                 <w:iCs/>
                 <w:lang w:val="en-US"/>
               </w:rPr>
-              <w:t>{{projectTasks}}</w:t>
+              <w:t xml:space="preserve">          </w:t>
+            </w:r>
+            <w:r>
+              <w:rPr>
+                <w:i/>
+                <w:iCs/>
+                <w:lang w:val="en-US"/>
+              </w:rPr>
+              <w:t>{{</w:t>
+            </w:r>
+            <w:proofErr w:type="spellStart"/>
+            <w:r>
+              <w:rPr>
+                <w:i/>
+                <w:iCs/>
+                <w:lang w:val="en-US"/>
+              </w:rPr>
+              <w:t>projectTasks</w:t>
+            </w:r>
+            <w:proofErr w:type="spellEnd"/>
+            <w:r>
+              <w:rPr>
+                <w:i/>
+                <w:iCs/>
+                <w:lang w:val="en-US"/>
+              </w:rPr>
+              <w:t>}}</w:t>
             </w:r>
           </w:p>
         </w:tc>
@@ -2674,7 +2790,6 @@
             <w:pPr>
               <w:pStyle w:val="TableParagraph"/>
               <w:spacing w:line="254" w:lineRule="auto"/>
-              <w:ind w:left="1440"/>
               <w:rPr>
                 <w:i/>
                 <w:sz w:val="24"/>
@@ -2686,8 +2801,25 @@
                 <w:sz w:val="24"/>
                 <w:lang w:val="en-US"/>
               </w:rPr>
+              <w:t xml:space="preserve">      </w:t>
+            </w:r>
+            <w:r>
+              <w:rPr>
+                <w:i/>
+                <w:sz w:val="24"/>
+                <w:lang w:val="en-US"/>
+              </w:rPr>
+              <w:t xml:space="preserve"> </w:t>
+            </w:r>
+            <w:r>
+              <w:rPr>
+                <w:i/>
+                <w:sz w:val="24"/>
+                <w:lang w:val="en-US"/>
+              </w:rPr>
               <w:t>{{</w:t>
             </w:r>
+            <w:proofErr w:type="spellStart"/>
             <w:r>
               <w:rPr>
                 <w:i/>
@@ -2704,6 +2836,7 @@
               </w:rPr>
               <w:t>lannedScientificResults</w:t>
             </w:r>
+            <w:proofErr w:type="spellEnd"/>
             <w:r>
               <w:rPr>
                 <w:i/>
@@ -2897,7 +3030,25 @@
                 <w:iCs/>
                 <w:lang w:val="en-US"/>
               </w:rPr>
-              <w:t>{{descriptionOfMethods}}</w:t>
+              <w:t>{{</w:t>
+            </w:r>
+            <w:proofErr w:type="spellStart"/>
+            <w:r>
+              <w:rPr>
+                <w:i/>
+                <w:iCs/>
+                <w:lang w:val="en-US"/>
+              </w:rPr>
+              <w:t>descriptionOfMethods</w:t>
+            </w:r>
+            <w:proofErr w:type="spellEnd"/>
+            <w:r>
+              <w:rPr>
+                <w:i/>
+                <w:iCs/>
+                <w:lang w:val="en-US"/>
+              </w:rPr>
+              <w:t>}}</w:t>
             </w:r>
           </w:p>
           <w:p>
@@ -3109,7 +3260,25 @@
                 <w:sz w:val="24"/>
                 <w:lang w:val="en-US"/>
               </w:rPr>
-              <w:t>{{descriptionOfScientificFuture}}</w:t>
+              <w:t>{{</w:t>
+            </w:r>
+            <w:proofErr w:type="spellStart"/>
+            <w:r>
+              <w:rPr>
+                <w:i/>
+                <w:sz w:val="24"/>
+                <w:lang w:val="en-US"/>
+              </w:rPr>
+              <w:t>descriptionOfScientificFuture</w:t>
+            </w:r>
+            <w:proofErr w:type="spellEnd"/>
+            <w:r>
+              <w:rPr>
+                <w:i/>
+                <w:sz w:val="24"/>
+                <w:lang w:val="en-US"/>
+              </w:rPr>
+              <w:t>}}</w:t>
             </w:r>
           </w:p>
         </w:tc>
@@ -3211,7 +3380,21 @@
                 <w:lang w:val="en-US"/>
               </w:rPr>
               <w:lastRenderedPageBreak/>
-              <w:t>{{futureResults}}</w:t>
+              <w:t>{{</w:t>
+            </w:r>
+            <w:proofErr w:type="spellStart"/>
+            <w:r>
+              <w:rPr>
+                <w:lang w:val="en-US"/>
+              </w:rPr>
+              <w:t>futureResults</w:t>
+            </w:r>
+            <w:proofErr w:type="spellEnd"/>
+            <w:r>
+              <w:rPr>
+                <w:lang w:val="en-US"/>
+              </w:rPr>
+              <w:t>}}</w:t>
             </w:r>
           </w:p>
         </w:tc>
@@ -3569,7 +3752,27 @@
                 <w:szCs w:val="23"/>
                 <w:lang w:val="en-US"/>
               </w:rPr>
-              <w:t>{{justificationOfRequestedFinancing}}</w:t>
+              <w:t>{{</w:t>
+            </w:r>
+            <w:proofErr w:type="spellStart"/>
+            <w:r>
+              <w:rPr>
+                <w:i/>
+                <w:sz w:val="23"/>
+                <w:szCs w:val="23"/>
+                <w:lang w:val="en-US"/>
+              </w:rPr>
+              <w:t>justificationOfRequestedFinancing</w:t>
+            </w:r>
+            <w:proofErr w:type="spellEnd"/>
+            <w:r>
+              <w:rPr>
+                <w:i/>
+                <w:sz w:val="23"/>
+                <w:szCs w:val="23"/>
+                <w:lang w:val="en-US"/>
+              </w:rPr>
+              <w:t>}}</w:t>
             </w:r>
           </w:p>
         </w:tc>
@@ -4364,7 +4567,23 @@
                 <w:sz w:val="23"/>
                 <w:lang w:val="en-US"/>
               </w:rPr>
-              <w:t>{{*researchTeams}}</w:t>
+              <w:t>{{*</w:t>
+            </w:r>
+            <w:proofErr w:type="spellStart"/>
+            <w:r>
+              <w:rPr>
+                <w:sz w:val="23"/>
+                <w:lang w:val="en-US"/>
+              </w:rPr>
+              <w:t>researchTeams</w:t>
+            </w:r>
+            <w:proofErr w:type="spellEnd"/>
+            <w:r>
+              <w:rPr>
+                <w:sz w:val="23"/>
+                <w:lang w:val="en-US"/>
+              </w:rPr>
+              <w:t>}}</w:t>
             </w:r>
           </w:p>
         </w:tc>
@@ -4600,7 +4819,25 @@
                 <w:sz w:val="24"/>
                 <w:lang w:val="en-US"/>
               </w:rPr>
-              <w:t>{{mainEducationalOrScientificUnit}}</w:t>
+              <w:t>{{</w:t>
+            </w:r>
+            <w:proofErr w:type="spellStart"/>
+            <w:r>
+              <w:rPr>
+                <w:i/>
+                <w:sz w:val="24"/>
+                <w:lang w:val="en-US"/>
+              </w:rPr>
+              <w:t>mainEducationalOrScientificUnit</w:t>
+            </w:r>
+            <w:proofErr w:type="spellEnd"/>
+            <w:r>
+              <w:rPr>
+                <w:i/>
+                <w:sz w:val="24"/>
+                <w:lang w:val="en-US"/>
+              </w:rPr>
+              <w:t>}}</w:t>
             </w:r>
           </w:p>
         </w:tc>
@@ -4849,7 +5086,25 @@
                 <w:sz w:val="24"/>
                 <w:lang w:val="en-US"/>
               </w:rPr>
-              <w:t>{{fullNameOfSupervisor}}</w:t>
+              <w:t>{{</w:t>
+            </w:r>
+            <w:proofErr w:type="spellStart"/>
+            <w:r>
+              <w:rPr>
+                <w:i/>
+                <w:sz w:val="24"/>
+                <w:lang w:val="en-US"/>
+              </w:rPr>
+              <w:t>fullNameOfSupervisor</w:t>
+            </w:r>
+            <w:proofErr w:type="spellEnd"/>
+            <w:r>
+              <w:rPr>
+                <w:i/>
+                <w:sz w:val="24"/>
+                <w:lang w:val="en-US"/>
+              </w:rPr>
+              <w:t>}}</w:t>
             </w:r>
           </w:p>
         </w:tc>
@@ -5104,7 +5359,25 @@
                 <w:sz w:val="24"/>
                 <w:lang w:val="en-US"/>
               </w:rPr>
-              <w:t>{{listOfEstimatedCosts}}</w:t>
+              <w:t>{{</w:t>
+            </w:r>
+            <w:proofErr w:type="spellStart"/>
+            <w:r>
+              <w:rPr>
+                <w:i/>
+                <w:sz w:val="24"/>
+                <w:lang w:val="en-US"/>
+              </w:rPr>
+              <w:t>listOfEstimatedCosts</w:t>
+            </w:r>
+            <w:proofErr w:type="spellEnd"/>
+            <w:r>
+              <w:rPr>
+                <w:i/>
+                <w:sz w:val="24"/>
+                <w:lang w:val="en-US"/>
+              </w:rPr>
+              <w:t>}}</w:t>
             </w:r>
           </w:p>
         </w:tc>
@@ -5196,27 +5469,26 @@
               <w:ind w:left="110"/>
               <w:rPr>
                 <w:sz w:val="24"/>
+              </w:rPr>
+            </w:pPr>
+            <w:r>
+              <w:rPr>
+                <w:sz w:val="24"/>
+              </w:rPr>
+              <w:t>{{</w:t>
+            </w:r>
+            <w:proofErr w:type="spellStart"/>
+            <w:r>
+              <w:rPr>
+                <w:sz w:val="24"/>
                 <w:lang w:val="en-US"/>
               </w:rPr>
-            </w:pPr>
-            <w:r>
-              <w:rPr>
-                <w:sz w:val="24"/>
-                <w:lang w:val="en-US"/>
-              </w:rPr>
-              <w:t>{{</w:t>
-            </w:r>
-            <w:r>
-              <w:rPr>
-                <w:sz w:val="24"/>
-                <w:lang w:val="en-US"/>
-              </w:rPr>
               <w:t>projectSupervisor</w:t>
             </w:r>
-            <w:r>
-              <w:rPr>
-                <w:sz w:val="24"/>
-                <w:lang w:val="en-US"/>
+            <w:proofErr w:type="spellEnd"/>
+            <w:r>
+              <w:rPr>
+                <w:sz w:val="24"/>
               </w:rPr>
               <w:t>}}</w:t>
             </w:r>
@@ -5333,7 +5605,21 @@
                                 <w:rPr>
                                   <w:sz w:val="23"/>
                                 </w:rPr>
-                                <w:t>{{projectSupervisor}}</w:t>
+                                <w:t>{{</w:t>
+                              </w:r>
+                              <w:proofErr w:type="spellStart"/>
+                              <w:r>
+                                <w:rPr>
+                                  <w:sz w:val="23"/>
+                                </w:rPr>
+                                <w:t>projectSupervisor</w:t>
+                              </w:r>
+                              <w:proofErr w:type="spellEnd"/>
+                              <w:r>
+                                <w:rPr>
+                                  <w:sz w:val="23"/>
+                                </w:rPr>
+                                <w:t>}}</w:t>
                               </w:r>
                             </w:p>
                             <w:p>
@@ -5498,7 +5784,21 @@
                           <w:rPr>
                             <w:sz w:val="23"/>
                           </w:rPr>
-                          <w:t>{{projectSupervisor}}</w:t>
+                          <w:t>{{</w:t>
+                        </w:r>
+                        <w:proofErr w:type="spellStart"/>
+                        <w:r>
+                          <w:rPr>
+                            <w:sz w:val="23"/>
+                          </w:rPr>
+                          <w:t>projectSupervisor</w:t>
+                        </w:r>
+                        <w:proofErr w:type="spellEnd"/>
+                        <w:r>
+                          <w:rPr>
+                            <w:sz w:val="23"/>
+                          </w:rPr>
+                          <w:t>}}</w:t>
                         </w:r>
                       </w:p>
                       <w:p>
@@ -6184,9 +6484,19 @@
               </w:rPr>
               <w:t xml:space="preserve"> </w:t>
             </w:r>
-            <w:r>
-              <w:t>WoS/Scopus</w:t>
-            </w:r>
+            <w:proofErr w:type="spellStart"/>
+            <w:r>
+              <w:t>WoS</w:t>
+            </w:r>
+            <w:proofErr w:type="spellEnd"/>
+            <w:r>
+              <w:t>/</w:t>
+            </w:r>
+            <w:proofErr w:type="spellStart"/>
+            <w:r>
+              <w:t>Scopus</w:t>
+            </w:r>
+            <w:proofErr w:type="spellEnd"/>
           </w:p>
         </w:tc>
         <w:tc>
@@ -6254,18 +6564,23 @@
               <w:pStyle w:val="TableParagraph"/>
               <w:jc w:val="center"/>
             </w:pPr>
+            <w:proofErr w:type="spellStart"/>
             <w:r>
               <w:t>mdpi</w:t>
             </w:r>
-            <w:r>
-              <w:t xml:space="preserve"> </w:t>
-            </w:r>
+            <w:proofErr w:type="spellEnd"/>
+            <w:r>
+              <w:t xml:space="preserve"> </w:t>
+            </w:r>
+            <w:proofErr w:type="spellStart"/>
             <w:r>
               <w:t>Mathematics</w:t>
             </w:r>
+            <w:proofErr w:type="spellEnd"/>
             <w:r>
               <w:t xml:space="preserve">, </w:t>
             </w:r>
+            <w:proofErr w:type="spellStart"/>
             <w:r>
               <w:rPr>
                 <w:sz w:val="24"/>
@@ -6273,6 +6588,7 @@
               </w:rPr>
               <w:t>Sensors</w:t>
             </w:r>
+            <w:proofErr w:type="spellEnd"/>
             <w:r>
               <w:t xml:space="preserve"> </w:t>
             </w:r>
@@ -6629,7 +6945,15 @@
               <w:jc w:val="center"/>
             </w:pPr>
             <w:r>
-              <w:t xml:space="preserve">в 1 год, 3  с публикацией </w:t>
+              <w:t xml:space="preserve">в 1 год, </w:t>
+            </w:r>
+            <w:proofErr w:type="gramStart"/>
+            <w:r>
+              <w:t>3  с</w:t>
+            </w:r>
+            <w:proofErr w:type="gramEnd"/>
+            <w:r>
+              <w:t xml:space="preserve"> публикацией </w:t>
             </w:r>
             <w:r>
               <w:rPr>
@@ -10059,7 +10383,15 @@
               <w:ind w:left="582" w:hanging="98"/>
             </w:pPr>
             <w:r>
-              <w:t>Младший н.с./ исполнитель</w:t>
+              <w:t xml:space="preserve">Младший </w:t>
+            </w:r>
+            <w:proofErr w:type="spellStart"/>
+            <w:r>
+              <w:t>н.с</w:t>
+            </w:r>
+            <w:proofErr w:type="spellEnd"/>
+            <w:r>
+              <w:t>./ исполнитель</w:t>
             </w:r>
             <w:r>
               <w:t xml:space="preserve"> (внешний)</w:t>
@@ -10838,7 +11170,23 @@
                 <w:sz w:val="24"/>
                 <w:szCs w:val="24"/>
               </w:rPr>
-              <w:t>Процессор: AMD Ryzen 9 5950X - 55 000 руб.</w:t>
+              <w:t xml:space="preserve">Процессор: AMD </w:t>
+            </w:r>
+            <w:proofErr w:type="spellStart"/>
+            <w:r>
+              <w:rPr>
+                <w:sz w:val="24"/>
+                <w:szCs w:val="24"/>
+              </w:rPr>
+              <w:t>Ryzen</w:t>
+            </w:r>
+            <w:proofErr w:type="spellEnd"/>
+            <w:r>
+              <w:rPr>
+                <w:sz w:val="24"/>
+                <w:szCs w:val="24"/>
+              </w:rPr>
+              <w:t xml:space="preserve"> 9 5950X - 55 000 руб.</w:t>
             </w:r>
           </w:p>
           <w:p>
@@ -10858,7 +11206,39 @@
                 <w:sz w:val="24"/>
                 <w:szCs w:val="24"/>
               </w:rPr>
-              <w:t>Материнская плата: ASUS ROG Crosshair VIII Hero - 40 000 руб.</w:t>
+              <w:t xml:space="preserve">Материнская плата: ASUS ROG </w:t>
+            </w:r>
+            <w:proofErr w:type="spellStart"/>
+            <w:r>
+              <w:rPr>
+                <w:sz w:val="24"/>
+                <w:szCs w:val="24"/>
+              </w:rPr>
+              <w:t>Crosshair</w:t>
+            </w:r>
+            <w:proofErr w:type="spellEnd"/>
+            <w:r>
+              <w:rPr>
+                <w:sz w:val="24"/>
+                <w:szCs w:val="24"/>
+              </w:rPr>
+              <w:t xml:space="preserve"> VIII </w:t>
+            </w:r>
+            <w:proofErr w:type="spellStart"/>
+            <w:r>
+              <w:rPr>
+                <w:sz w:val="24"/>
+                <w:szCs w:val="24"/>
+              </w:rPr>
+              <w:t>Hero</w:t>
+            </w:r>
+            <w:proofErr w:type="spellEnd"/>
+            <w:r>
+              <w:rPr>
+                <w:sz w:val="24"/>
+                <w:szCs w:val="24"/>
+              </w:rPr>
+              <w:t xml:space="preserve"> - 40 000 руб.</w:t>
             </w:r>
           </w:p>
           <w:p>
@@ -10898,7 +11278,23 @@
                 <w:sz w:val="24"/>
                 <w:szCs w:val="24"/>
               </w:rPr>
-              <w:t>SSD накопитель: 2 ТБ NVMe SSD - 25 000 руб.</w:t>
+              <w:t xml:space="preserve">SSD накопитель: 2 ТБ </w:t>
+            </w:r>
+            <w:proofErr w:type="spellStart"/>
+            <w:r>
+              <w:rPr>
+                <w:sz w:val="24"/>
+                <w:szCs w:val="24"/>
+              </w:rPr>
+              <w:t>NVMe</w:t>
+            </w:r>
+            <w:proofErr w:type="spellEnd"/>
+            <w:r>
+              <w:rPr>
+                <w:sz w:val="24"/>
+                <w:szCs w:val="24"/>
+              </w:rPr>
+              <w:t xml:space="preserve"> SSD - 25 000 руб.</w:t>
             </w:r>
           </w:p>
           <w:p>
@@ -10918,8 +11314,33 @@
                 <w:sz w:val="24"/>
                 <w:szCs w:val="24"/>
               </w:rPr>
-              <w:t>Видеокарта: NVIDIA RTX 3080 Ti - 150 000 руб</w:t>
-            </w:r>
+              <w:t xml:space="preserve">Видеокарта: NVIDIA RTX 3080 </w:t>
+            </w:r>
+            <w:proofErr w:type="spellStart"/>
+            <w:r>
+              <w:rPr>
+                <w:sz w:val="24"/>
+                <w:szCs w:val="24"/>
+              </w:rPr>
+              <w:t>Ti</w:t>
+            </w:r>
+            <w:proofErr w:type="spellEnd"/>
+            <w:r>
+              <w:rPr>
+                <w:sz w:val="24"/>
+                <w:szCs w:val="24"/>
+              </w:rPr>
+              <w:t xml:space="preserve"> - 150 000 </w:t>
+            </w:r>
+            <w:proofErr w:type="spellStart"/>
+            <w:r>
+              <w:rPr>
+                <w:sz w:val="24"/>
+                <w:szCs w:val="24"/>
+              </w:rPr>
+              <w:t>руб</w:t>
+            </w:r>
+            <w:proofErr w:type="spellEnd"/>
           </w:p>
           <w:p>
             <w:pPr>
@@ -11716,7 +12137,25 @@
                 <w:szCs w:val="24"/>
                 <w:lang w:eastAsia="ru-RU"/>
               </w:rPr>
-              <w:t>SSD накопители: 2 x 2 ТБ NVMe SSD - 50 000 руб.</w:t>
+              <w:t xml:space="preserve">SSD накопители: 2 x 2 ТБ </w:t>
+            </w:r>
+            <w:proofErr w:type="spellStart"/>
+            <w:r>
+              <w:rPr>
+                <w:sz w:val="24"/>
+                <w:szCs w:val="24"/>
+                <w:lang w:eastAsia="ru-RU"/>
+              </w:rPr>
+              <w:t>NVMe</w:t>
+            </w:r>
+            <w:proofErr w:type="spellEnd"/>
+            <w:r>
+              <w:rPr>
+                <w:sz w:val="24"/>
+                <w:szCs w:val="24"/>
+                <w:lang w:eastAsia="ru-RU"/>
+              </w:rPr>
+              <w:t xml:space="preserve"> SSD - 50 000 руб.</w:t>
             </w:r>
           </w:p>
           <w:p>
@@ -13039,12 +13478,14 @@
               </w:rPr>
               <w:t xml:space="preserve">000 </w:t>
             </w:r>
+            <w:proofErr w:type="spellStart"/>
             <w:r>
               <w:rPr>
                 <w:color w:val="2E2F30"/>
               </w:rPr>
               <w:t>руб</w:t>
             </w:r>
+            <w:proofErr w:type="spellEnd"/>
             <w:r>
               <w:rPr>
                 <w:color w:val="2E2F30"/>
@@ -13128,12 +13569,14 @@
               </w:rPr>
               <w:t xml:space="preserve">000 </w:t>
             </w:r>
+            <w:proofErr w:type="spellStart"/>
             <w:r>
               <w:rPr>
                 <w:color w:val="2E2F30"/>
               </w:rPr>
               <w:t>руб</w:t>
             </w:r>
+            <w:proofErr w:type="spellEnd"/>
           </w:p>
           <w:p>
             <w:pPr>
@@ -13250,11 +13693,19 @@
                 <w:color w:val="2E2F30"/>
               </w:rPr>
             </w:pPr>
+            <w:proofErr w:type="spellStart"/>
             <w:r>
               <w:rPr>
                 <w:color w:val="2E2F30"/>
               </w:rPr>
-              <w:t xml:space="preserve">Mathematica (2 академические лицензии) </w:t>
+              <w:t>Mathematica</w:t>
+            </w:r>
+            <w:proofErr w:type="spellEnd"/>
+            <w:r>
+              <w:rPr>
+                <w:color w:val="2E2F30"/>
+              </w:rPr>
+              <w:t xml:space="preserve"> (2 академические лицензии) </w:t>
             </w:r>
             <w:r>
               <w:rPr>
@@ -13374,12 +13825,14 @@
               </w:rPr>
               <w:t xml:space="preserve">000 </w:t>
             </w:r>
+            <w:proofErr w:type="spellStart"/>
             <w:r>
               <w:rPr>
                 <w:color w:val="2E2F30"/>
               </w:rPr>
               <w:t>руб</w:t>
             </w:r>
+            <w:proofErr w:type="spellEnd"/>
             <w:r>
               <w:rPr>
                 <w:color w:val="2E2F30"/>
@@ -13446,11 +13899,19 @@
                 <w:color w:val="2E2F30"/>
               </w:rPr>
             </w:pPr>
+            <w:proofErr w:type="spellStart"/>
             <w:r>
               <w:rPr>
                 <w:color w:val="2E2F30"/>
               </w:rPr>
-              <w:t>Tableau Desktop (</w:t>
+              <w:t>Tableau</w:t>
+            </w:r>
+            <w:proofErr w:type="spellEnd"/>
+            <w:r>
+              <w:rPr>
+                <w:color w:val="2E2F30"/>
+              </w:rPr>
+              <w:t xml:space="preserve"> Desktop (</w:t>
             </w:r>
             <w:r>
               <w:rPr>
@@ -13544,7 +14005,21 @@
               <w:rPr>
                 <w:color w:val="2E2F30"/>
               </w:rPr>
-              <w:t xml:space="preserve">Google Cloud Platform или Amazon Web Services - кредиты на </w:t>
+              <w:t xml:space="preserve">Google </w:t>
+            </w:r>
+            <w:proofErr w:type="spellStart"/>
+            <w:r>
+              <w:rPr>
+                <w:color w:val="2E2F30"/>
+              </w:rPr>
+              <w:t>Cloud</w:t>
+            </w:r>
+            <w:proofErr w:type="spellEnd"/>
+            <w:r>
+              <w:rPr>
+                <w:color w:val="2E2F30"/>
+              </w:rPr>
+              <w:t xml:space="preserve"> Platform или Amazon Web Services - кредиты на </w:t>
             </w:r>
             <w:r>
               <w:rPr>
@@ -13629,11 +14104,33 @@
                 <w:color w:val="2E2F30"/>
               </w:rPr>
             </w:pPr>
+            <w:proofErr w:type="spellStart"/>
             <w:r>
               <w:rPr>
                 <w:color w:val="2E2F30"/>
               </w:rPr>
-              <w:t>JetBrains DataGrip (</w:t>
+              <w:t>JetBrains</w:t>
+            </w:r>
+            <w:proofErr w:type="spellEnd"/>
+            <w:r>
+              <w:rPr>
+                <w:color w:val="2E2F30"/>
+              </w:rPr>
+              <w:t xml:space="preserve"> </w:t>
+            </w:r>
+            <w:proofErr w:type="spellStart"/>
+            <w:r>
+              <w:rPr>
+                <w:color w:val="2E2F30"/>
+              </w:rPr>
+              <w:t>DataGrip</w:t>
+            </w:r>
+            <w:proofErr w:type="spellEnd"/>
+            <w:r>
+              <w:rPr>
+                <w:color w:val="2E2F30"/>
+              </w:rPr>
+              <w:t xml:space="preserve"> (</w:t>
             </w:r>
             <w:r>
               <w:rPr>
@@ -18840,28 +19337,21 @@
               <w:pStyle w:val="TableParagraph"/>
               <w:spacing w:line="252" w:lineRule="exact"/>
               <w:ind w:left="110"/>
-              <w:rPr>
+            </w:pPr>
+            <w:bookmarkStart w:id="7" w:name="_Hlk197618273"/>
+            <w:r>
+              <w:t>{{</w:t>
+            </w:r>
+            <w:proofErr w:type="spellStart"/>
+            <w:r>
+              <w:rPr>
+                <w:sz w:val="24"/>
                 <w:lang w:val="en-US"/>
               </w:rPr>
-            </w:pPr>
-            <w:bookmarkStart w:id="7" w:name="_Hlk197618273"/>
-            <w:r>
-              <w:rPr>
-                <w:lang w:val="en-US"/>
-              </w:rPr>
-              <w:t>{{</w:t>
-            </w:r>
-            <w:r>
-              <w:rPr>
-                <w:sz w:val="24"/>
-                <w:lang w:val="en-US"/>
-              </w:rPr>
               <w:t>projectSupervisor</w:t>
             </w:r>
-            <w:r>
-              <w:rPr>
-                <w:lang w:val="en-US"/>
-              </w:rPr>
+            <w:proofErr w:type="spellEnd"/>
+            <w:r>
               <w:t>}}</w:t>
             </w:r>
           </w:p>
@@ -18873,7 +19363,6 @@
               <w:ind w:left="110" w:right="8679"/>
               <w:rPr>
                 <w:spacing w:val="1"/>
-                <w:lang w:val="en-US"/>
               </w:rPr>
             </w:pPr>
             <w:r>
@@ -18898,9 +19387,21 @@
             <w:r>
               <w:rPr>
                 <w:spacing w:val="1"/>
+              </w:rPr>
+              <w:t>{{</w:t>
+            </w:r>
+            <w:r>
+              <w:rPr>
+                <w:spacing w:val="1"/>
                 <w:lang w:val="en-US"/>
               </w:rPr>
-              <w:t>{{date}}</w:t>
+              <w:t>date</w:t>
+            </w:r>
+            <w:r>
+              <w:rPr>
+                <w:spacing w:val="1"/>
+              </w:rPr>
+              <w:t>}}</w:t>
             </w:r>
             <w:r>
               <w:rPr>
@@ -32020,7 +32521,6 @@
   <w:style w:type="character" w:default="1" w:styleId="DefaultParagraphFont">
     <w:name w:val="Default Paragraph Font"/>
     <w:uiPriority w:val="1"/>
-    <w:semiHidden/>
     <w:unhideWhenUsed/>
   </w:style>
   <w:style w:type="table" w:default="1" w:styleId="TableNormal">

</xml_diff>

<commit_message>
feat(microservices: Emiren): fixing some moments focused on contest
</commit_message>
<xml_diff>
--- a/protocol/src/main/resources/contest_template.docx
+++ b/protocol/src/main/resources/contest_template.docx
@@ -4,7 +4,7 @@
   <w:body>
     <w:p>
       <w:pPr>
-        <w:pStyle w:val="Heading1"/>
+        <w:pStyle w:val="1"/>
         <w:ind w:left="341" w:right="323"/>
         <w:jc w:val="center"/>
         <w:rPr>
@@ -1496,7 +1496,7 @@
     </w:tbl>
     <w:p>
       <w:pPr>
-        <w:pStyle w:val="BodyText"/>
+        <w:pStyle w:val="a3"/>
         <w:spacing w:before="3"/>
         <w:ind w:left="0"/>
         <w:rPr>
@@ -1520,7 +1520,7 @@
     </w:p>
     <w:p>
       <w:pPr>
-        <w:pStyle w:val="Heading1"/>
+        <w:pStyle w:val="1"/>
         <w:spacing w:before="74"/>
         <w:ind w:left="339" w:right="323"/>
         <w:jc w:val="center"/>
@@ -2516,7 +2516,6 @@
           <w:p>
             <w:pPr>
               <w:pStyle w:val="TableParagraph"/>
-              <w:ind w:left="720"/>
               <w:rPr>
                 <w:i/>
                 <w:sz w:val="23"/>
@@ -2643,14 +2642,6 @@
                 <w:iCs/>
                 <w:lang w:val="en-US"/>
               </w:rPr>
-              <w:t xml:space="preserve">          </w:t>
-            </w:r>
-            <w:r>
-              <w:rPr>
-                <w:i/>
-                <w:iCs/>
-                <w:lang w:val="en-US"/>
-              </w:rPr>
               <w:t>{{</w:t>
             </w:r>
             <w:proofErr w:type="spellStart"/>
@@ -2801,22 +2792,6 @@
                 <w:sz w:val="24"/>
                 <w:lang w:val="en-US"/>
               </w:rPr>
-              <w:t xml:space="preserve">      </w:t>
-            </w:r>
-            <w:r>
-              <w:rPr>
-                <w:i/>
-                <w:sz w:val="24"/>
-                <w:lang w:val="en-US"/>
-              </w:rPr>
-              <w:t xml:space="preserve"> </w:t>
-            </w:r>
-            <w:r>
-              <w:rPr>
-                <w:i/>
-                <w:sz w:val="24"/>
-                <w:lang w:val="en-US"/>
-              </w:rPr>
               <w:t>{{</w:t>
             </w:r>
             <w:proofErr w:type="spellStart"/>
@@ -3018,7 +2993,6 @@
             <w:pPr>
               <w:pStyle w:val="whitespace-normal"/>
               <w:spacing w:before="0" w:beforeAutospacing="0" w:after="0" w:afterAutospacing="0"/>
-              <w:ind w:left="720"/>
               <w:rPr>
                 <w:i/>
                 <w:iCs/>
@@ -3247,7 +3221,6 @@
             <w:pPr>
               <w:pStyle w:val="TableParagraph"/>
               <w:spacing w:line="272" w:lineRule="exact"/>
-              <w:ind w:left="110"/>
               <w:rPr>
                 <w:i/>
                 <w:sz w:val="24"/>
@@ -3373,7 +3346,6 @@
             <w:pPr>
               <w:pStyle w:val="whitespace-normal"/>
               <w:spacing w:before="0" w:beforeAutospacing="0" w:after="120" w:afterAutospacing="0"/>
-              <w:ind w:left="720"/>
             </w:pPr>
             <w:r>
               <w:rPr>
@@ -3738,7 +3710,6 @@
             <w:pPr>
               <w:pStyle w:val="TableParagraph"/>
               <w:spacing w:line="254" w:lineRule="auto"/>
-              <w:ind w:left="720"/>
               <w:rPr>
                 <w:i/>
                 <w:sz w:val="23"/>
@@ -3780,7 +3751,7 @@
     </w:tbl>
     <w:p>
       <w:pPr>
-        <w:pStyle w:val="BodyText"/>
+        <w:pStyle w:val="a3"/>
         <w:spacing w:before="10"/>
         <w:ind w:left="0"/>
         <w:rPr>
@@ -8031,7 +8002,7 @@
     </w:tbl>
     <w:p>
       <w:pPr>
-        <w:pStyle w:val="BodyText"/>
+        <w:pStyle w:val="a3"/>
         <w:spacing w:before="7"/>
         <w:ind w:left="0"/>
         <w:rPr>
@@ -8168,7 +8139,7 @@
     </w:p>
     <w:p>
       <w:pPr>
-        <w:pStyle w:val="BodyText"/>
+        <w:pStyle w:val="a3"/>
         <w:spacing w:before="3"/>
         <w:ind w:left="0"/>
         <w:rPr>
@@ -13365,7 +13336,7 @@
               <w:shd w:val="clear" w:color="auto" w:fill="FFFFFF"/>
               <w:spacing w:before="0" w:beforeAutospacing="0" w:after="0" w:afterAutospacing="0"/>
               <w:rPr>
-                <w:rStyle w:val="Strong"/>
+                <w:rStyle w:val="a9"/>
                 <w:color w:val="2E2F30"/>
               </w:rPr>
             </w:pPr>
@@ -13381,28 +13352,28 @@
             </w:pPr>
             <w:r>
               <w:rPr>
-                <w:rStyle w:val="Strong"/>
+                <w:rStyle w:val="a9"/>
                 <w:color w:val="2E2F30"/>
               </w:rPr>
               <w:t xml:space="preserve"> Среды разработки и инструменты</w:t>
             </w:r>
             <w:r>
               <w:rPr>
-                <w:rStyle w:val="Strong"/>
+                <w:rStyle w:val="a9"/>
                 <w:color w:val="2E2F30"/>
               </w:rPr>
               <w:t xml:space="preserve"> (</w:t>
             </w:r>
             <w:r>
               <w:rPr>
-                <w:rStyle w:val="Strong"/>
+                <w:rStyle w:val="a9"/>
                 <w:color w:val="2E2F30"/>
               </w:rPr>
               <w:t>90</w:t>
             </w:r>
             <w:r>
               <w:rPr>
-                <w:rStyle w:val="Strong"/>
+                <w:rStyle w:val="a9"/>
                 <w:color w:val="2E2F30"/>
               </w:rPr>
               <w:t xml:space="preserve"> 000)</w:t>
@@ -13584,40 +13555,40 @@
               <w:shd w:val="clear" w:color="auto" w:fill="FFFFFF"/>
               <w:spacing w:before="0" w:beforeAutospacing="0" w:after="0" w:afterAutospacing="0"/>
               <w:rPr>
-                <w:rStyle w:val="Strong"/>
-              </w:rPr>
-            </w:pPr>
-            <w:r>
-              <w:rPr>
-                <w:rStyle w:val="Strong"/>
+                <w:rStyle w:val="a9"/>
+              </w:rPr>
+            </w:pPr>
+            <w:r>
+              <w:rPr>
+                <w:rStyle w:val="a9"/>
                 <w:color w:val="2E2F30"/>
               </w:rPr>
               <w:t>Математическое ПО</w:t>
             </w:r>
             <w:r>
               <w:rPr>
-                <w:rStyle w:val="Strong"/>
+                <w:rStyle w:val="a9"/>
                 <w:color w:val="2E2F30"/>
               </w:rPr>
               <w:t xml:space="preserve"> (2</w:t>
             </w:r>
             <w:r>
               <w:rPr>
-                <w:rStyle w:val="Strong"/>
+                <w:rStyle w:val="a9"/>
                 <w:color w:val="2E2F30"/>
               </w:rPr>
               <w:t>4</w:t>
             </w:r>
             <w:r>
               <w:rPr>
-                <w:rStyle w:val="Strong"/>
+                <w:rStyle w:val="a9"/>
                 <w:color w:val="2E2F30"/>
               </w:rPr>
               <w:t>0 000)</w:t>
             </w:r>
             <w:r>
               <w:rPr>
-                <w:rStyle w:val="Strong"/>
+                <w:rStyle w:val="a9"/>
               </w:rPr>
               <w:t>:</w:t>
             </w:r>
@@ -13738,26 +13709,26 @@
               <w:shd w:val="clear" w:color="auto" w:fill="FFFFFF"/>
               <w:spacing w:before="0" w:beforeAutospacing="0" w:after="0" w:afterAutospacing="0"/>
               <w:rPr>
-                <w:rStyle w:val="Strong"/>
-              </w:rPr>
-            </w:pPr>
-            <w:r>
-              <w:rPr>
-                <w:rStyle w:val="Strong"/>
+                <w:rStyle w:val="a9"/>
+              </w:rPr>
+            </w:pPr>
+            <w:r>
+              <w:rPr>
+                <w:rStyle w:val="a9"/>
                 <w:color w:val="2E2F30"/>
               </w:rPr>
               <w:t>Инструменты для анализа производительности и отладки</w:t>
             </w:r>
             <w:r>
               <w:rPr>
-                <w:rStyle w:val="Strong"/>
+                <w:rStyle w:val="a9"/>
                 <w:color w:val="2E2F30"/>
               </w:rPr>
               <w:t xml:space="preserve"> (60 000)</w:t>
             </w:r>
             <w:r>
               <w:rPr>
-                <w:rStyle w:val="Strong"/>
+                <w:rStyle w:val="a9"/>
               </w:rPr>
               <w:t>:</w:t>
             </w:r>
@@ -13847,40 +13818,40 @@
               <w:shd w:val="clear" w:color="auto" w:fill="FFFFFF"/>
               <w:spacing w:before="0" w:beforeAutospacing="0" w:after="0" w:afterAutospacing="0"/>
               <w:rPr>
-                <w:rStyle w:val="Strong"/>
-              </w:rPr>
-            </w:pPr>
-            <w:r>
-              <w:rPr>
-                <w:rStyle w:val="Strong"/>
+                <w:rStyle w:val="a9"/>
+              </w:rPr>
+            </w:pPr>
+            <w:r>
+              <w:rPr>
+                <w:rStyle w:val="a9"/>
                 <w:color w:val="2E2F30"/>
               </w:rPr>
               <w:t>Инструменты для визуализации данных</w:t>
             </w:r>
             <w:r>
               <w:rPr>
-                <w:rStyle w:val="Strong"/>
+                <w:rStyle w:val="a9"/>
                 <w:color w:val="2E2F30"/>
               </w:rPr>
               <w:t xml:space="preserve"> (</w:t>
             </w:r>
             <w:r>
               <w:rPr>
-                <w:rStyle w:val="Strong"/>
+                <w:rStyle w:val="a9"/>
                 <w:color w:val="2E2F30"/>
               </w:rPr>
               <w:t>30</w:t>
             </w:r>
             <w:r>
               <w:rPr>
-                <w:rStyle w:val="Strong"/>
+                <w:rStyle w:val="a9"/>
                 <w:color w:val="2E2F30"/>
               </w:rPr>
               <w:t xml:space="preserve"> 000)</w:t>
             </w:r>
             <w:r>
               <w:rPr>
-                <w:rStyle w:val="Strong"/>
+                <w:rStyle w:val="a9"/>
               </w:rPr>
               <w:t>:</w:t>
             </w:r>
@@ -13962,12 +13933,12 @@
               <w:shd w:val="clear" w:color="auto" w:fill="FFFFFF"/>
               <w:spacing w:before="0" w:beforeAutospacing="0" w:after="0" w:afterAutospacing="0"/>
               <w:rPr>
-                <w:rStyle w:val="Strong"/>
-              </w:rPr>
-            </w:pPr>
-            <w:r>
-              <w:rPr>
-                <w:rStyle w:val="Strong"/>
+                <w:rStyle w:val="a9"/>
+              </w:rPr>
+            </w:pPr>
+            <w:r>
+              <w:rPr>
+                <w:rStyle w:val="a9"/>
                 <w:color w:val="2E2F30"/>
               </w:rPr>
               <w:lastRenderedPageBreak/>
@@ -13975,14 +13946,14 @@
             </w:r>
             <w:r>
               <w:rPr>
-                <w:rStyle w:val="Strong"/>
+                <w:rStyle w:val="a9"/>
                 <w:color w:val="2E2F30"/>
               </w:rPr>
               <w:t xml:space="preserve"> (100 000)</w:t>
             </w:r>
             <w:r>
               <w:rPr>
-                <w:rStyle w:val="Strong"/>
+                <w:rStyle w:val="a9"/>
               </w:rPr>
               <w:t>:</w:t>
             </w:r>
@@ -14052,40 +14023,40 @@
               <w:shd w:val="clear" w:color="auto" w:fill="FFFFFF"/>
               <w:spacing w:before="0" w:beforeAutospacing="0" w:after="0" w:afterAutospacing="0"/>
               <w:rPr>
-                <w:rStyle w:val="Strong"/>
-              </w:rPr>
-            </w:pPr>
-            <w:r>
-              <w:rPr>
-                <w:rStyle w:val="Strong"/>
+                <w:rStyle w:val="a9"/>
+              </w:rPr>
+            </w:pPr>
+            <w:r>
+              <w:rPr>
+                <w:rStyle w:val="a9"/>
                 <w:color w:val="2E2F30"/>
               </w:rPr>
               <w:t>Дополнительное ПО</w:t>
             </w:r>
             <w:r>
               <w:rPr>
-                <w:rStyle w:val="Strong"/>
+                <w:rStyle w:val="a9"/>
                 <w:color w:val="2E2F30"/>
               </w:rPr>
               <w:t xml:space="preserve"> (</w:t>
             </w:r>
             <w:r>
               <w:rPr>
-                <w:rStyle w:val="Strong"/>
+                <w:rStyle w:val="a9"/>
                 <w:color w:val="2E2F30"/>
               </w:rPr>
               <w:t>70</w:t>
             </w:r>
             <w:r>
               <w:rPr>
-                <w:rStyle w:val="Strong"/>
+                <w:rStyle w:val="a9"/>
                 <w:color w:val="2E2F30"/>
               </w:rPr>
               <w:t xml:space="preserve"> 000)</w:t>
             </w:r>
             <w:r>
               <w:rPr>
-                <w:rStyle w:val="Strong"/>
+                <w:rStyle w:val="a9"/>
               </w:rPr>
               <w:t>:</w:t>
             </w:r>
@@ -14231,7 +14202,7 @@
             </w:pPr>
             <w:r>
               <w:rPr>
-                <w:rStyle w:val="Strong"/>
+                <w:rStyle w:val="a9"/>
                 <w:color w:val="2E2F30"/>
               </w:rPr>
               <w:t>Резерв на обновления и непредвиденные расходы</w:t>
@@ -14246,19 +14217,19 @@
             </w:r>
             <w:r>
               <w:rPr>
-                <w:rStyle w:val="Strong"/>
+                <w:rStyle w:val="a9"/>
               </w:rPr>
               <w:t>10</w:t>
             </w:r>
             <w:r>
               <w:rPr>
-                <w:rStyle w:val="Strong"/>
-              </w:rPr>
-              <w:t xml:space="preserve"> </w:t>
-            </w:r>
-            <w:r>
-              <w:rPr>
-                <w:rStyle w:val="Strong"/>
+                <w:rStyle w:val="a9"/>
+              </w:rPr>
+              <w:t xml:space="preserve"> </w:t>
+            </w:r>
+            <w:r>
+              <w:rPr>
+                <w:rStyle w:val="a9"/>
               </w:rPr>
               <w:t>000 руб.</w:t>
             </w:r>
@@ -19457,7 +19428,7 @@
 <w:ftr xmlns:wpc="http://schemas.microsoft.com/office/word/2010/wordprocessingCanvas" xmlns:cx="http://schemas.microsoft.com/office/drawing/2014/chartex" xmlns:cx1="http://schemas.microsoft.com/office/drawing/2015/9/8/chartex" xmlns:cx2="http://schemas.microsoft.com/office/drawing/2015/10/21/chartex" xmlns:cx3="http://schemas.microsoft.com/office/drawing/2016/5/9/chartex" xmlns:cx4="http://schemas.microsoft.com/office/drawing/2016/5/10/chartex" xmlns:cx5="http://schemas.microsoft.com/office/drawing/2016/5/11/chartex" xmlns:cx6="http://schemas.microsoft.com/office/drawing/2016/5/12/chartex" xmlns:cx7="http://schemas.microsoft.com/office/drawing/2016/5/13/chartex" xmlns:cx8="http://schemas.microsoft.com/office/drawing/2016/5/14/chartex" xmlns:mc="http://schemas.openxmlformats.org/markup-compatibility/2006" xmlns:aink="http://schemas.microsoft.com/office/drawing/2016/ink" xmlns:am3d="http://schemas.microsoft.com/office/drawing/2017/model3d" xmlns:o="urn:schemas-microsoft-com:office:office" xmlns:oel="http://schemas.microsoft.com/office/2019/extlst" xmlns:r="http://schemas.openxmlformats.org/officeDocument/2006/relationships" xmlns:m="http://schemas.openxmlformats.org/officeDocument/2006/math" xmlns:v="urn:schemas-microsoft-com:vml" xmlns:wp14="http://schemas.microsoft.com/office/word/2010/wordprocessingDrawing" xmlns:wp="http://schemas.openxmlformats.org/drawingml/2006/wordprocessingDrawing" xmlns:w10="urn:schemas-microsoft-com:office:word" xmlns:w="http://schemas.openxmlformats.org/wordprocessingml/2006/main" xmlns:w14="http://schemas.microsoft.com/office/word/2010/wordml" xmlns:w15="http://schemas.microsoft.com/office/word/2012/wordml" xmlns:w16cex="http://schemas.microsoft.com/office/word/2018/wordml/cex" xmlns:w16cid="http://schemas.microsoft.com/office/word/2016/wordml/cid" xmlns:w16="http://schemas.microsoft.com/office/word/2018/wordml" xmlns:w16sdtdh="http://schemas.microsoft.com/office/word/2020/wordml/sdtdatahash" xmlns:w16se="http://schemas.microsoft.com/office/word/2015/wordml/symex" xmlns:wpg="http://schemas.microsoft.com/office/word/2010/wordprocessingGroup" xmlns:wpi="http://schemas.microsoft.com/office/word/2010/wordprocessingInk" xmlns:wne="http://schemas.microsoft.com/office/word/2006/wordml" xmlns:wps="http://schemas.microsoft.com/office/word/2010/wordprocessingShape" mc:Ignorable="w14 w15 w16se w16cid w16 w16cex w16sdtdh wp14">
   <w:p>
     <w:pPr>
-      <w:pStyle w:val="BodyText"/>
+      <w:pStyle w:val="a3"/>
       <w:spacing w:line="14" w:lineRule="auto"/>
       <w:ind w:left="0"/>
       <w:rPr>
@@ -19619,7 +19590,7 @@
     <w:sdtContent>
       <w:p>
         <w:pPr>
-          <w:pStyle w:val="Footer"/>
+          <w:pStyle w:val="a7"/>
           <w:jc w:val="center"/>
         </w:pPr>
         <w:r>
@@ -19642,7 +19613,7 @@
   </w:sdt>
   <w:p>
     <w:pPr>
-      <w:pStyle w:val="BodyText"/>
+      <w:pStyle w:val="a3"/>
       <w:spacing w:line="14" w:lineRule="auto"/>
       <w:ind w:left="0"/>
       <w:rPr>
@@ -32465,7 +32436,7 @@
     <w:lsdException w:name="Unresolved Mention" w:semiHidden="1" w:unhideWhenUsed="1"/>
     <w:lsdException w:name="Smart Link" w:semiHidden="1" w:unhideWhenUsed="1"/>
   </w:latentStyles>
-  <w:style w:type="paragraph" w:default="1" w:styleId="Normal">
+  <w:style w:type="paragraph" w:default="1" w:styleId="a">
     <w:name w:val="Normal"/>
     <w:qFormat/>
     <w:rPr>
@@ -32473,9 +32444,9 @@
       <w:lang w:val="ru-RU"/>
     </w:rPr>
   </w:style>
-  <w:style w:type="paragraph" w:styleId="Heading1">
+  <w:style w:type="paragraph" w:styleId="1">
     <w:name w:val="heading 1"/>
-    <w:basedOn w:val="Normal"/>
+    <w:basedOn w:val="a"/>
     <w:uiPriority w:val="9"/>
     <w:qFormat/>
     <w:pPr>
@@ -32490,11 +32461,11 @@
       <w:szCs w:val="28"/>
     </w:rPr>
   </w:style>
-  <w:style w:type="paragraph" w:styleId="Heading4">
+  <w:style w:type="paragraph" w:styleId="4">
     <w:name w:val="heading 4"/>
-    <w:basedOn w:val="Normal"/>
-    <w:next w:val="Normal"/>
-    <w:link w:val="Heading4Char"/>
+    <w:basedOn w:val="a"/>
+    <w:next w:val="a"/>
+    <w:link w:val="40"/>
     <w:uiPriority w:val="9"/>
     <w:semiHidden/>
     <w:unhideWhenUsed/>
@@ -32518,12 +32489,13 @@
       <w14:ligatures w14:val="standardContextual"/>
     </w:rPr>
   </w:style>
-  <w:style w:type="character" w:default="1" w:styleId="DefaultParagraphFont">
+  <w:style w:type="character" w:default="1" w:styleId="a0">
     <w:name w:val="Default Paragraph Font"/>
     <w:uiPriority w:val="1"/>
+    <w:semiHidden/>
     <w:unhideWhenUsed/>
   </w:style>
-  <w:style w:type="table" w:default="1" w:styleId="TableNormal">
+  <w:style w:type="table" w:default="1" w:styleId="a1">
     <w:name w:val="Normal Table"/>
     <w:uiPriority w:val="99"/>
     <w:semiHidden/>
@@ -32538,7 +32510,7 @@
       </w:tblCellMar>
     </w:tblPr>
   </w:style>
-  <w:style w:type="numbering" w:default="1" w:styleId="NoList">
+  <w:style w:type="numbering" w:default="1" w:styleId="a2">
     <w:name w:val="No List"/>
     <w:uiPriority w:val="99"/>
     <w:semiHidden/>
@@ -32560,9 +32532,9 @@
       </w:tblCellMar>
     </w:tblPr>
   </w:style>
-  <w:style w:type="paragraph" w:styleId="BodyText">
+  <w:style w:type="paragraph" w:styleId="a3">
     <w:name w:val="Body Text"/>
-    <w:basedOn w:val="Normal"/>
+    <w:basedOn w:val="a"/>
     <w:uiPriority w:val="1"/>
     <w:qFormat/>
     <w:pPr>
@@ -32573,9 +32545,9 @@
       <w:szCs w:val="28"/>
     </w:rPr>
   </w:style>
-  <w:style w:type="paragraph" w:styleId="ListParagraph">
+  <w:style w:type="paragraph" w:styleId="a4">
     <w:name w:val="List Paragraph"/>
-    <w:basedOn w:val="Normal"/>
+    <w:basedOn w:val="a"/>
     <w:uiPriority w:val="1"/>
     <w:qFormat/>
     <w:pPr>
@@ -32585,13 +32557,13 @@
   </w:style>
   <w:style w:type="paragraph" w:customStyle="1" w:styleId="TableParagraph">
     <w:name w:val="Table Paragraph"/>
-    <w:basedOn w:val="Normal"/>
+    <w:basedOn w:val="a"/>
     <w:uiPriority w:val="1"/>
     <w:qFormat/>
   </w:style>
   <w:style w:type="paragraph" w:customStyle="1" w:styleId="whitespace-pre-wrap">
     <w:name w:val="whitespace-pre-wrap"/>
-    <w:basedOn w:val="Normal"/>
+    <w:basedOn w:val="a"/>
     <w:rsid w:val="00F02C5C"/>
     <w:pPr>
       <w:widowControl/>
@@ -32607,7 +32579,7 @@
   </w:style>
   <w:style w:type="paragraph" w:customStyle="1" w:styleId="whitespace-normal">
     <w:name w:val="whitespace-normal"/>
-    <w:basedOn w:val="Normal"/>
+    <w:basedOn w:val="a"/>
     <w:rsid w:val="00F02C5C"/>
     <w:pPr>
       <w:widowControl/>
@@ -32621,10 +32593,10 @@
       <w:lang w:eastAsia="ru-RU"/>
     </w:rPr>
   </w:style>
-  <w:style w:type="paragraph" w:styleId="Header">
+  <w:style w:type="paragraph" w:styleId="a5">
     <w:name w:val="header"/>
-    <w:basedOn w:val="Normal"/>
-    <w:link w:val="HeaderChar"/>
+    <w:basedOn w:val="a"/>
+    <w:link w:val="a6"/>
     <w:uiPriority w:val="99"/>
     <w:unhideWhenUsed/>
     <w:rsid w:val="00C71B10"/>
@@ -32635,10 +32607,10 @@
       </w:tabs>
     </w:pPr>
   </w:style>
-  <w:style w:type="character" w:customStyle="1" w:styleId="HeaderChar">
-    <w:name w:val="Header Char"/>
-    <w:basedOn w:val="DefaultParagraphFont"/>
-    <w:link w:val="Header"/>
+  <w:style w:type="character" w:customStyle="1" w:styleId="a6">
+    <w:name w:val="Верхний колонтитул Знак"/>
+    <w:basedOn w:val="a0"/>
+    <w:link w:val="a5"/>
     <w:uiPriority w:val="99"/>
     <w:rsid w:val="00C71B10"/>
     <w:rPr>
@@ -32646,10 +32618,10 @@
       <w:lang w:val="ru-RU"/>
     </w:rPr>
   </w:style>
-  <w:style w:type="paragraph" w:styleId="Footer">
+  <w:style w:type="paragraph" w:styleId="a7">
     <w:name w:val="footer"/>
-    <w:basedOn w:val="Normal"/>
-    <w:link w:val="FooterChar"/>
+    <w:basedOn w:val="a"/>
+    <w:link w:val="a8"/>
     <w:uiPriority w:val="99"/>
     <w:unhideWhenUsed/>
     <w:rsid w:val="00C71B10"/>
@@ -32660,10 +32632,10 @@
       </w:tabs>
     </w:pPr>
   </w:style>
-  <w:style w:type="character" w:customStyle="1" w:styleId="FooterChar">
-    <w:name w:val="Footer Char"/>
-    <w:basedOn w:val="DefaultParagraphFont"/>
-    <w:link w:val="Footer"/>
+  <w:style w:type="character" w:customStyle="1" w:styleId="a8">
+    <w:name w:val="Нижний колонтитул Знак"/>
+    <w:basedOn w:val="a0"/>
+    <w:link w:val="a7"/>
     <w:uiPriority w:val="99"/>
     <w:rsid w:val="00C71B10"/>
     <w:rPr>
@@ -32671,10 +32643,10 @@
       <w:lang w:val="ru-RU"/>
     </w:rPr>
   </w:style>
-  <w:style w:type="character" w:customStyle="1" w:styleId="Heading4Char">
-    <w:name w:val="Heading 4 Char"/>
-    <w:basedOn w:val="DefaultParagraphFont"/>
-    <w:link w:val="Heading4"/>
+  <w:style w:type="character" w:customStyle="1" w:styleId="40">
+    <w:name w:val="Заголовок 4 Знак"/>
+    <w:basedOn w:val="a0"/>
+    <w:link w:val="4"/>
     <w:uiPriority w:val="9"/>
     <w:semiHidden/>
     <w:rsid w:val="00EE4F76"/>
@@ -32690,7 +32662,7 @@
   </w:style>
   <w:style w:type="paragraph" w:customStyle="1" w:styleId="answerparserlistitemxqlov">
     <w:name w:val="answerparser_listitem__xqlov"/>
-    <w:basedOn w:val="Normal"/>
+    <w:basedOn w:val="a"/>
     <w:rsid w:val="00EE4F76"/>
     <w:pPr>
       <w:widowControl/>
@@ -32706,12 +32678,12 @@
   </w:style>
   <w:style w:type="character" w:customStyle="1" w:styleId="answerparsertextcontainerziiv">
     <w:name w:val="answerparser_textcontainer__z_iiv"/>
-    <w:basedOn w:val="DefaultParagraphFont"/>
+    <w:basedOn w:val="a0"/>
     <w:rsid w:val="00EE4F76"/>
   </w:style>
-  <w:style w:type="character" w:styleId="Strong">
+  <w:style w:type="character" w:styleId="a9">
     <w:name w:val="Strong"/>
-    <w:basedOn w:val="DefaultParagraphFont"/>
+    <w:basedOn w:val="a0"/>
     <w:uiPriority w:val="22"/>
     <w:qFormat/>
     <w:rsid w:val="00EE4F76"/>
@@ -32720,9 +32692,9 @@
       <w:bCs/>
     </w:rPr>
   </w:style>
-  <w:style w:type="character" w:styleId="Hyperlink">
+  <w:style w:type="character" w:styleId="aa">
     <w:name w:val="Hyperlink"/>
-    <w:basedOn w:val="DefaultParagraphFont"/>
+    <w:basedOn w:val="a0"/>
     <w:uiPriority w:val="99"/>
     <w:unhideWhenUsed/>
     <w:rsid w:val="001C0E24"/>
@@ -32731,9 +32703,9 @@
       <w:u w:val="single"/>
     </w:rPr>
   </w:style>
-  <w:style w:type="character" w:styleId="UnresolvedMention">
+  <w:style w:type="character" w:styleId="ab">
     <w:name w:val="Unresolved Mention"/>
-    <w:basedOn w:val="DefaultParagraphFont"/>
+    <w:basedOn w:val="a0"/>
     <w:uiPriority w:val="99"/>
     <w:semiHidden/>
     <w:unhideWhenUsed/>
@@ -32745,13 +32717,13 @@
   </w:style>
   <w:style w:type="character" w:customStyle="1" w:styleId="wmi-callto">
     <w:name w:val="wmi-callto"/>
-    <w:basedOn w:val="DefaultParagraphFont"/>
+    <w:basedOn w:val="a0"/>
     <w:rsid w:val="00C34B3E"/>
   </w:style>
-  <w:style w:type="paragraph" w:styleId="HTMLPreformatted">
+  <w:style w:type="paragraph" w:styleId="HTML">
     <w:name w:val="HTML Preformatted"/>
-    <w:basedOn w:val="Normal"/>
-    <w:link w:val="HTMLPreformattedChar"/>
+    <w:basedOn w:val="a"/>
+    <w:link w:val="HTML0"/>
     <w:uiPriority w:val="99"/>
     <w:semiHidden/>
     <w:unhideWhenUsed/>
@@ -32762,10 +32734,10 @@
       <w:szCs w:val="20"/>
     </w:rPr>
   </w:style>
-  <w:style w:type="character" w:customStyle="1" w:styleId="HTMLPreformattedChar">
-    <w:name w:val="HTML Preformatted Char"/>
-    <w:basedOn w:val="DefaultParagraphFont"/>
-    <w:link w:val="HTMLPreformatted"/>
+  <w:style w:type="character" w:customStyle="1" w:styleId="HTML0">
+    <w:name w:val="Стандартный HTML Знак"/>
+    <w:basedOn w:val="a0"/>
+    <w:link w:val="HTML"/>
     <w:uiPriority w:val="99"/>
     <w:semiHidden/>
     <w:rsid w:val="00AB163B"/>

</xml_diff>